<commit_message>
Atualiza página de título do texto de apoio
Co-Authored-By: Claude Opus 5.5 <noreply@anthropic.com>
Claude-Session: https://claude.ai/code/session_01Fw3p3SJe9q66XANFx1dFHd
</commit_message>
<xml_diff>
--- a/AI_Act_APA7.docx
+++ b/AI_Act_APA7.docx
@@ -84,7 +84,7 @@
           <w:sz w:val="24"/>
           <w:szCs w:val="24"/>
         </w:rPr>
-        <w:t xml:space="preserve">[Instituição]</w:t>
+        <w:t xml:space="preserve">Universidade Lusófona</w:t>
       </w:r>
     </w:p>
     <w:p>
@@ -99,7 +99,7 @@
           <w:sz w:val="24"/>
           <w:szCs w:val="24"/>
         </w:rPr>
-        <w:t xml:space="preserve">[Unidade curricular]</w:t>
+        <w:t xml:space="preserve">Privacidade, Segurança e Ética em Ciência de Dados</w:t>
       </w:r>
     </w:p>
     <w:p>
@@ -114,7 +114,7 @@
           <w:sz w:val="24"/>
           <w:szCs w:val="24"/>
         </w:rPr>
-        <w:t xml:space="preserve">[Docente]</w:t>
+        <w:t xml:space="preserve">Nuno Mateus Coelho</w:t>
       </w:r>
     </w:p>
     <w:p>

</xml_diff>